<commit_message>
feat: initial commit for deployment
</commit_message>
<xml_diff>
--- a/참가신청서.docx
+++ b/참가신청서.docx
@@ -914,7 +914,6 @@
               </w:rPr>
               <w:t xml:space="preserve"> </w:t>
             </w:r>
-            <w:proofErr w:type="spellStart"/>
             <w:r>
               <w:rPr>
                 <w:rFonts w:ascii="맑은 고딕" w:eastAsia="맑은 고딕" w:cs="맑은 고딕" w:hint="eastAsia"/>
@@ -924,7 +923,6 @@
               </w:rPr>
               <w:t>유창재</w:t>
             </w:r>
-            <w:proofErr w:type="spellEnd"/>
           </w:p>
         </w:tc>
         <w:tc>
@@ -1110,7 +1108,7 @@
               <w:wordWrap/>
               <w:jc w:val="center"/>
               <w:rPr>
-                <w:rFonts w:ascii="맑은 고딕" w:eastAsia="맑은 고딕" w:cs="맑은 고딕" w:hint="eastAsia"/>
+                <w:rFonts w:ascii="맑은 고딕" w:eastAsia="맑은 고딕" w:cs="맑은 고딕"/>
                 <w:color w:val="000000" w:themeColor="text1"/>
                 <w:sz w:val="24"/>
                 <w:szCs w:val="24"/>
@@ -1247,7 +1245,7 @@
               <w:wordWrap/>
               <w:jc w:val="center"/>
               <w:rPr>
-                <w:rFonts w:ascii="맑은 고딕" w:eastAsia="맑은 고딕" w:cs="맑은 고딕" w:hint="eastAsia"/>
+                <w:rFonts w:ascii="맑은 고딕" w:eastAsia="맑은 고딕" w:cs="맑은 고딕"/>
                 <w:color w:val="000000" w:themeColor="text1"/>
                 <w:sz w:val="24"/>
                 <w:szCs w:val="24"/>
@@ -1448,7 +1446,6 @@
                 <w:szCs w:val="24"/>
               </w:rPr>
             </w:pPr>
-            <w:proofErr w:type="spellStart"/>
             <w:r>
               <w:rPr>
                 <w:rFonts w:ascii="맑은 고딕" w:eastAsia="맑은 고딕" w:cs="맑은 고딕"/>
@@ -1459,7 +1456,6 @@
               </w:rPr>
               <w:t>팀명</w:t>
             </w:r>
-            <w:proofErr w:type="spellEnd"/>
           </w:p>
         </w:tc>
         <w:tc>
@@ -1510,6 +1506,14 @@
                 <w:szCs w:val="24"/>
               </w:rPr>
             </w:pPr>
+            <w:r>
+              <w:rPr>
+                <w:rFonts w:ascii="맑은 고딕" w:eastAsia="맑은 고딕" w:cs="맑은 고딕" w:hint="eastAsia"/>
+                <w:sz w:val="24"/>
+                <w:szCs w:val="24"/>
+              </w:rPr>
+              <w:t>유창재</w:t>
+            </w:r>
           </w:p>
         </w:tc>
       </w:tr>
@@ -2949,42 +2953,12 @@
             <w:vAlign w:val="center"/>
           </w:tcPr>
           <w:p>
-            <w:proofErr w:type="spellStart"/>
             <w:r>
               <w:rPr>
                 <w:rFonts w:ascii="맑은 고딕" w:hAnsi="맑은 고딕"/>
               </w:rPr>
-              <w:t>SafeRoute</w:t>
-            </w:r>
-            <w:proofErr w:type="spellEnd"/>
-            <w:r>
-              <w:rPr>
-                <w:rFonts w:ascii="맑은 고딕" w:hAnsi="맑은 고딕"/>
-              </w:rPr>
-              <w:t xml:space="preserve"> AI (</w:t>
-            </w:r>
-            <w:proofErr w:type="spellStart"/>
-            <w:r>
-              <w:rPr>
-                <w:rFonts w:ascii="맑은 고딕" w:hAnsi="맑은 고딕"/>
-              </w:rPr>
-              <w:t>DiploLife</w:t>
-            </w:r>
-            <w:proofErr w:type="spellEnd"/>
-            <w:r>
-              <w:rPr>
-                <w:rFonts w:ascii="맑은 고딕" w:hAnsi="맑은 고딕"/>
-              </w:rPr>
-              <w:t xml:space="preserve">) : 외교 공공데이터와 Gemini AI를 결합한 초개인화 해외 안전 여행 일정 </w:t>
-            </w:r>
-            <w:proofErr w:type="spellStart"/>
-            <w:r>
-              <w:rPr>
-                <w:rFonts w:ascii="맑은 고딕" w:hAnsi="맑은 고딕"/>
-              </w:rPr>
-              <w:t>플래너</w:t>
-            </w:r>
-            <w:proofErr w:type="spellEnd"/>
+              <w:t>SafeRoute AI (DiploLife) : 외교 공공데이터와 Gemini AI를 결합한 초개인화 해외 안전 여행 일정 플래너</w:t>
+            </w:r>
           </w:p>
         </w:tc>
       </w:tr>
@@ -3097,47 +3071,11 @@
             <w:vAlign w:val="center"/>
           </w:tcPr>
           <w:p>
-            <w:proofErr w:type="spellStart"/>
             <w:r>
               <w:rPr>
                 <w:rFonts w:ascii="맑은 고딕" w:hAnsi="맑은 고딕"/>
               </w:rPr>
-              <w:t>SafeRoute</w:t>
-            </w:r>
-            <w:proofErr w:type="spellEnd"/>
-            <w:r>
-              <w:rPr>
-                <w:rFonts w:ascii="맑은 고딕" w:hAnsi="맑은 고딕"/>
-              </w:rPr>
-              <w:t xml:space="preserve"> AI (</w:t>
-            </w:r>
-            <w:proofErr w:type="spellStart"/>
-            <w:r>
-              <w:rPr>
-                <w:rFonts w:ascii="맑은 고딕" w:hAnsi="맑은 고딕"/>
-              </w:rPr>
-              <w:t>DiploLife</w:t>
-            </w:r>
-            <w:proofErr w:type="spellEnd"/>
-            <w:r>
-              <w:rPr>
-                <w:rFonts w:ascii="맑은 고딕" w:hAnsi="맑은 고딕"/>
-              </w:rPr>
-              <w:t>)는 사용자의 숙소 위치를 기반으로 출발부터 귀가까지의 모든 동선을 자동으로 짜주는 '원터치 타임라인 일정 생성 서비스'입니다. Google Gemini AI 모델과 구글 Maps Directions API를 융합하여 장소 간 실제 이동 시간(도보/대중교통)을 분 단위로 계산하고, 그 일정 위에 외교부의 '해외안전 공공데이터(여행경보, 재외공관, 현지연락처 등)'를 매핑하여 위기 상황에 즉각 대처할 수 있는 '능동형 비상 카드'</w:t>
-            </w:r>
-            <w:proofErr w:type="spellStart"/>
-            <w:r>
-              <w:rPr>
-                <w:rFonts w:ascii="맑은 고딕" w:hAnsi="맑은 고딕"/>
-              </w:rPr>
-              <w:t>를</w:t>
-            </w:r>
-            <w:proofErr w:type="spellEnd"/>
-            <w:r>
-              <w:rPr>
-                <w:rFonts w:ascii="맑은 고딕" w:hAnsi="맑은 고딕"/>
-              </w:rPr>
-              <w:t xml:space="preserve"> 제공합니다. 사용자는 친근한 UI(먼치킨 고양이 가이드 등)를 통해 복잡한 검색 없이 최적화된 동선과 안전 정보를 동시에 얻을 수 있습니다.</w:t>
+              <w:t>SafeRoute AI (DiploLife)는 사용자의 숙소 위치를 기반으로 출발부터 귀가까지의 모든 동선을 자동으로 짜주는 '원터치 타임라인 일정 생성 서비스'입니다. Google Gemini AI 모델과 구글 Maps Directions API를 융합하여 장소 간 실제 이동 시간(도보/대중교통)을 분 단위로 계산하고, 그 일정 위에 외교부의 '해외안전 공공데이터(여행경보, 재외공관, 현지연락처 등)'를 매핑하여 위기 상황에 즉각 대처할 수 있는 '능동형 비상 카드'를 제공합니다. 사용자는 친근한 UI(먼치킨 고양이 가이드 등)를 통해 복잡한 검색 없이 최적화된 동선과 안전 정보를 동시에 얻을 수 있습니다.</w:t>
             </w:r>
           </w:p>
         </w:tc>
@@ -3353,27 +3291,7 @@
                 <w:sz w:val="22"/>
                 <w:szCs w:val="22"/>
               </w:rPr>
-              <w:t xml:space="preserve"> AI 활용 </w:t>
-            </w:r>
-            <w:proofErr w:type="spellStart"/>
-            <w:r>
-              <w:rPr>
-                <w:rFonts w:ascii="맑은 고딕" w:eastAsia="맑은 고딕" w:cs="맑은 고딕"/>
-                <w:spacing w:val="-3"/>
-                <w:sz w:val="22"/>
-                <w:szCs w:val="22"/>
-              </w:rPr>
-              <w:t>경진대회」에</w:t>
-            </w:r>
-            <w:proofErr w:type="spellEnd"/>
-            <w:r>
-              <w:rPr>
-                <w:rFonts w:ascii="맑은 고딕" w:eastAsia="맑은 고딕" w:cs="맑은 고딕"/>
-                <w:spacing w:val="-3"/>
-                <w:sz w:val="22"/>
-                <w:szCs w:val="22"/>
-              </w:rPr>
-              <w:t xml:space="preserve"> 참가함에 있어, 다음 규정을 준수할 것을 서약합니다. </w:t>
+              <w:t xml:space="preserve"> AI 활용 경진대회」에 참가함에 있어, 다음 규정을 준수할 것을 서약합니다. </w:t>
             </w:r>
           </w:p>
           <w:p>
@@ -3904,7 +3822,7 @@
                 <w:sz w:val="24"/>
                 <w:szCs w:val="24"/>
               </w:rPr>
-              <w:t>3</w:t>
+              <w:t>4</w:t>
             </w:r>
             <w:r>
               <w:rPr>
@@ -4025,7 +3943,6 @@
               </w:rPr>
               <w:t xml:space="preserve">                                              신청인     </w:t>
             </w:r>
-            <w:proofErr w:type="spellStart"/>
             <w:r>
               <w:rPr>
                 <w:rFonts w:ascii="맑은 고딕" w:eastAsia="맑은 고딕" w:cs="맑은 고딕" w:hint="eastAsia"/>
@@ -4034,7 +3951,6 @@
               </w:rPr>
               <w:t>유창재</w:t>
             </w:r>
-            <w:proofErr w:type="spellEnd"/>
             <w:r>
               <w:rPr>
                 <w:rFonts w:ascii="맑은 고딕" w:eastAsia="맑은 고딕" w:cs="맑은 고딕"/>
@@ -5558,7 +5474,6 @@
                 <w:szCs w:val="18"/>
               </w:rPr>
             </w:pPr>
-            <w:proofErr w:type="spellStart"/>
             <w:r>
               <w:rPr>
                 <w:rFonts w:ascii="맑은 고딕" w:eastAsia="맑은 고딕" w:cs="맑은 고딕" w:hint="eastAsia"/>
@@ -5568,7 +5483,6 @@
               </w:rPr>
               <w:t>유창재</w:t>
             </w:r>
-            <w:proofErr w:type="spellEnd"/>
           </w:p>
         </w:tc>
         <w:tc>
@@ -6195,33 +6109,11 @@
             <w:vAlign w:val="center"/>
           </w:tcPr>
           <w:p>
-            <w:proofErr w:type="spellStart"/>
             <w:r>
               <w:rPr>
                 <w:rFonts w:ascii="맑은 고딕" w:hAnsi="맑은 고딕"/>
               </w:rPr>
-              <w:t>SafeRoute</w:t>
-            </w:r>
-            <w:proofErr w:type="spellEnd"/>
-            <w:r>
-              <w:rPr>
-                <w:rFonts w:ascii="맑은 고딕" w:hAnsi="맑은 고딕"/>
-              </w:rPr>
-              <w:t xml:space="preserve"> AI (</w:t>
-            </w:r>
-            <w:proofErr w:type="spellStart"/>
-            <w:r>
-              <w:rPr>
-                <w:rFonts w:ascii="맑은 고딕" w:hAnsi="맑은 고딕"/>
-              </w:rPr>
-              <w:t>DiploLife</w:t>
-            </w:r>
-            <w:proofErr w:type="spellEnd"/>
-            <w:r>
-              <w:rPr>
-                <w:rFonts w:ascii="맑은 고딕" w:hAnsi="맑은 고딕"/>
-              </w:rPr>
-              <w:t>)</w:t>
+              <w:t>SafeRoute AI (DiploLife)</w:t>
             </w:r>
           </w:p>
         </w:tc>
@@ -6487,21 +6379,7 @@
                 <w:rFonts w:ascii="맑은 고딕" w:hAnsi="맑은 고딕"/>
               </w:rPr>
               <w:br/>
-              <w:t xml:space="preserve">- </w:t>
-            </w:r>
-            <w:proofErr w:type="spellStart"/>
-            <w:r>
-              <w:rPr>
-                <w:rFonts w:ascii="맑은 고딕" w:hAnsi="맑은 고딕"/>
-              </w:rPr>
-              <w:t>단편화된</w:t>
-            </w:r>
-            <w:proofErr w:type="spellEnd"/>
-            <w:r>
-              <w:rPr>
-                <w:rFonts w:ascii="맑은 고딕" w:hAnsi="맑은 고딕"/>
-              </w:rPr>
-              <w:t xml:space="preserve"> 여행 정보의 통합 한계: 여행객들은 동선은 지도 앱으로 짜고, 안전 정보는 외교부 사이트에서 따로 찾아야 하므로 번거로움과 정보 누락의 위험이 큽니다.</w:t>
+              <w:t>- 단편화된 여행 정보의 통합 한계: 여행객들은 동선은 지도 앱으로 짜고, 안전 정보는 외교부 사이트에서 따로 찾아야 하므로 번거로움과 정보 누락의 위험이 큽니다.</w:t>
             </w:r>
             <w:r>
               <w:rPr>
@@ -6535,21 +6413,7 @@
                 <w:rFonts w:ascii="맑은 고딕" w:hAnsi="맑은 고딕"/>
               </w:rPr>
               <w:br/>
-              <w:t>- 숙소 기반 타임라인 자동 완성: 사용자의 '숙소'</w:t>
-            </w:r>
-            <w:proofErr w:type="spellStart"/>
-            <w:r>
-              <w:rPr>
-                <w:rFonts w:ascii="맑은 고딕" w:hAnsi="맑은 고딕"/>
-              </w:rPr>
-              <w:t>를</w:t>
-            </w:r>
-            <w:proofErr w:type="spellEnd"/>
-            <w:r>
-              <w:rPr>
-                <w:rFonts w:ascii="맑은 고딕" w:hAnsi="맑은 고딕"/>
-              </w:rPr>
-              <w:t xml:space="preserve"> 출발 및 복귀 지점으로 삼고, Gemini AI와 Google Maps Directions API를 호출하여 장소 간 실제 이동 시간과 거리를 도보/대중교통에 맞게 정확히 산출하여 타임라인을 자동 생성합니다.</w:t>
+              <w:t>- 숙소 기반 타임라인 자동 완성: 사용자의 '숙소'를 출발 및 복귀 지점으로 삼고, Gemini AI와 Google Maps Directions API를 호출하여 장소 간 실제 이동 시간과 거리를 도보/대중교통에 맞게 정확히 산출하여 타임라인을 자동 생성합니다.</w:t>
             </w:r>
             <w:r>
               <w:rPr>
@@ -6563,21 +6427,7 @@
                 <w:rFonts w:ascii="맑은 고딕" w:hAnsi="맑은 고딕"/>
               </w:rPr>
               <w:br/>
-              <w:t xml:space="preserve">- UI/UX 고도화 및 동선 시각화: 타임라인 인터페이스 상에서 이동 구간(점선)과 예상 이동 소요 시간을 한눈에 보여주며, 지도 위에는 숙소 마커와 전체 일정을 잇는 </w:t>
-            </w:r>
-            <w:proofErr w:type="spellStart"/>
-            <w:r>
-              <w:rPr>
-                <w:rFonts w:ascii="맑은 고딕" w:hAnsi="맑은 고딕"/>
-              </w:rPr>
-              <w:t>폴리라인을</w:t>
-            </w:r>
-            <w:proofErr w:type="spellEnd"/>
-            <w:r>
-              <w:rPr>
-                <w:rFonts w:ascii="맑은 고딕" w:hAnsi="맑은 고딕"/>
-              </w:rPr>
-              <w:t xml:space="preserve"> 그려 직관적인 뷰를 제공합니다.</w:t>
+              <w:t>- UI/UX 고도화 및 동선 시각화: 타임라인 인터페이스 상에서 이동 구간(점선)과 예상 이동 소요 시간을 한눈에 보여주며, 지도 위에는 숙소 마커와 전체 일정을 잇는 폴리라인을 그려 직관적인 뷰를 제공합니다.</w:t>
             </w:r>
             <w:r>
               <w:rPr>
@@ -6618,42 +6468,14 @@
                 <w:rFonts w:ascii="맑은 고딕" w:hAnsi="맑은 고딕"/>
               </w:rPr>
               <w:br/>
-              <w:t xml:space="preserve">  3. 재외공관 &amp; 현지 연락처 (API 15075354, 15076242): 일정 중 긴급 상황 발생을 대비해, 가장 가까운 재외공관 좌표와 현지 긴급 번호가 담긴 '안전 비상 카드'</w:t>
-            </w:r>
-            <w:proofErr w:type="spellStart"/>
+              <w:t xml:space="preserve">  3. 재외공관 &amp; 현지 연락처 (API 15075354, 15076242): 일정 중 긴급 상황 발생을 대비해, 가장 가까운 재외공관 좌표와 현지 긴급 번호가 담긴 '안전 비상 카드'를 Gemini를 통해 JSON 형태로 가공하여 제공합니다.</w:t>
+            </w:r>
             <w:r>
               <w:rPr>
                 <w:rFonts w:ascii="맑은 고딕" w:hAnsi="맑은 고딕"/>
               </w:rPr>
-              <w:t>를</w:t>
-            </w:r>
-            <w:proofErr w:type="spellEnd"/>
-            <w:r>
-              <w:rPr>
-                <w:rFonts w:ascii="맑은 고딕" w:hAnsi="맑은 고딕"/>
-              </w:rPr>
-              <w:t xml:space="preserve"> Gemini를 통해 JSON 형태로 가공하여 제공합니다.</w:t>
-            </w:r>
-            <w:r>
-              <w:rPr>
-                <w:rFonts w:ascii="맑은 고딕" w:hAnsi="맑은 고딕"/>
-              </w:rPr>
               <w:br/>
-              <w:t xml:space="preserve">- 데이터 처리 전략: 클라이언트가 공공데이터를 직접 호출하지 않고 서버에서 데이터를 </w:t>
-            </w:r>
-            <w:proofErr w:type="spellStart"/>
-            <w:r>
-              <w:rPr>
-                <w:rFonts w:ascii="맑은 고딕" w:hAnsi="맑은 고딕"/>
-              </w:rPr>
-              <w:t>정규화한</w:t>
-            </w:r>
-            <w:proofErr w:type="spellEnd"/>
-            <w:r>
-              <w:rPr>
-                <w:rFonts w:ascii="맑은 고딕" w:hAnsi="맑은 고딕"/>
-              </w:rPr>
-              <w:t xml:space="preserve"> 뒤, Gemini API에 근거 자료로 주입하여 신뢰도 100%의 브리핑 결과를 UI로 전달합니다.</w:t>
+              <w:t>- 데이터 처리 전략: 클라이언트가 공공데이터를 직접 호출하지 않고 서버에서 데이터를 정규화한 뒤, Gemini API에 근거 자료로 주입하여 신뢰도 100%의 브리핑 결과를 UI로 전달합니다.</w:t>
             </w:r>
             <w:r>
               <w:rPr>
@@ -6686,21 +6508,7 @@
                 <w:rFonts w:ascii="맑은 고딕" w:hAnsi="맑은 고딕"/>
               </w:rPr>
               <w:lastRenderedPageBreak/>
-              <w:t xml:space="preserve">- 정밀한 이동 시간 및 컷오프(Cut-off) 로직: 단순 직선거리가 아닌 실제 지도 API 결과를 누적해 가며, 약속된 일정 종료 시간(예: 19:00)을 초과할 경우 마지막 장소를 자동으로 </w:t>
-            </w:r>
-            <w:proofErr w:type="spellStart"/>
-            <w:r>
-              <w:rPr>
-                <w:rFonts w:ascii="맑은 고딕" w:hAnsi="맑은 고딕"/>
-              </w:rPr>
-              <w:t>컷오프하여</w:t>
-            </w:r>
-            <w:proofErr w:type="spellEnd"/>
-            <w:r>
-              <w:rPr>
-                <w:rFonts w:ascii="맑은 고딕" w:hAnsi="맑은 고딕"/>
-              </w:rPr>
-              <w:t xml:space="preserve"> 일정을 현실에 맞게 마감하는 시스템을 갖췄습니다.</w:t>
+              <w:t>- 정밀한 이동 시간 및 컷오프(Cut-off) 로직: 단순 직선거리가 아닌 실제 지도 API 결과를 누적해 가며, 약속된 일정 종료 시간(예: 19:00)을 초과할 경우 마지막 장소를 자동으로 컷오프하여 일정을 현실에 맞게 마감하는 시스템을 갖췄습니다.</w:t>
             </w:r>
             <w:r>
               <w:rPr>
@@ -6720,21 +6528,7 @@
                 <w:rFonts w:ascii="맑은 고딕" w:hAnsi="맑은 고딕"/>
               </w:rPr>
               <w:br/>
-              <w:t xml:space="preserve">- </w:t>
-            </w:r>
-            <w:proofErr w:type="spellStart"/>
-            <w:r>
-              <w:rPr>
-                <w:rFonts w:ascii="맑은 고딕" w:hAnsi="맑은 고딕"/>
-              </w:rPr>
-              <w:t>안전권</w:t>
-            </w:r>
-            <w:proofErr w:type="spellEnd"/>
-            <w:r>
-              <w:rPr>
-                <w:rFonts w:ascii="맑은 고딕" w:hAnsi="맑은 고딕"/>
-              </w:rPr>
-              <w:t xml:space="preserve"> 보장 체감도 상승: 해외 낯선 환경에서도 클릭 한 번으로 대사관 위치와 비상 연락망, 여행 경보를 직관적으로 숙지할 수 있어 국민의 능동적인 위기 대처 능력이 상향됩니다.</w:t>
+              <w:t>- 안전권 보장 체감도 상승: 해외 낯선 환경에서도 클릭 한 번으로 대사관 위치와 비상 연락망, 여행 경보를 직관적으로 숙지할 수 있어 국민의 능동적인 위기 대처 능력이 상향됩니다.</w:t>
             </w:r>
             <w:r>
               <w:rPr>
@@ -6775,21 +6569,7 @@
                 <w:rFonts w:ascii="맑은 고딕" w:hAnsi="맑은 고딕"/>
               </w:rPr>
               <w:br/>
-              <w:t xml:space="preserve">- 3단계 (B2B 솔루션 확장): 축적된 라우팅 알고리즘과 안전 보정 시스템을 여행사 패키지 고객 모니터링 시스템용 API로 제공하여 글로벌 </w:t>
-            </w:r>
-            <w:proofErr w:type="spellStart"/>
-            <w:r>
-              <w:rPr>
-                <w:rFonts w:ascii="맑은 고딕" w:hAnsi="맑은 고딕"/>
-              </w:rPr>
-              <w:t>트래블테크</w:t>
-            </w:r>
-            <w:proofErr w:type="spellEnd"/>
-            <w:r>
-              <w:rPr>
-                <w:rFonts w:ascii="맑은 고딕" w:hAnsi="맑은 고딕"/>
-              </w:rPr>
-              <w:t xml:space="preserve"> B2B 시장으로 진출합니다.</w:t>
+              <w:t>- 3단계 (B2B 솔루션 확장): 축적된 라우팅 알고리즘과 안전 보정 시스템을 여행사 패키지 고객 모니터링 시스템용 API로 제공하여 글로벌 트래블테크 B2B 시장으로 진출합니다.</w:t>
             </w:r>
             <w:r>
               <w:rPr>
@@ -8695,7 +8475,7 @@
                 <w:sz w:val="24"/>
                 <w:szCs w:val="24"/>
               </w:rPr>
-              <w:t>3</w:t>
+              <w:t>4</w:t>
             </w:r>
             <w:r>
               <w:rPr>
@@ -8797,7 +8577,6 @@
               </w:rPr>
               <w:t xml:space="preserve">                                              신청인     </w:t>
             </w:r>
-            <w:proofErr w:type="spellStart"/>
             <w:r>
               <w:rPr>
                 <w:rFonts w:ascii="맑은 고딕" w:eastAsia="맑은 고딕" w:cs="맑은 고딕" w:hint="eastAsia"/>
@@ -8806,7 +8585,6 @@
               </w:rPr>
               <w:t>유창재</w:t>
             </w:r>
-            <w:proofErr w:type="spellEnd"/>
             <w:r>
               <w:rPr>
                 <w:rFonts w:ascii="맑은 고딕" w:eastAsia="맑은 고딕" w:cs="맑은 고딕"/>
@@ -11162,43 +10940,7 @@
                 <w:sz w:val="18"/>
                 <w:szCs w:val="18"/>
               </w:rPr>
-              <w:t xml:space="preserve"> (유의사항) 법정대리인이 </w:t>
-            </w:r>
-            <w:proofErr w:type="spellStart"/>
-            <w:r>
-              <w:rPr>
-                <w:rFonts w:ascii="맑은 고딕" w:eastAsia="맑은 고딕" w:cs="맑은 고딕"/>
-                <w:sz w:val="18"/>
-                <w:szCs w:val="18"/>
-              </w:rPr>
-              <w:t>공동친권자인</w:t>
-            </w:r>
-            <w:proofErr w:type="spellEnd"/>
-            <w:r>
-              <w:rPr>
-                <w:rFonts w:ascii="맑은 고딕" w:eastAsia="맑은 고딕" w:cs="맑은 고딕"/>
-                <w:sz w:val="18"/>
-                <w:szCs w:val="18"/>
-              </w:rPr>
-              <w:t xml:space="preserve"> 경우 </w:t>
-            </w:r>
-            <w:proofErr w:type="spellStart"/>
-            <w:r>
-              <w:rPr>
-                <w:rFonts w:ascii="맑은 고딕" w:eastAsia="맑은 고딕" w:cs="맑은 고딕"/>
-                <w:sz w:val="18"/>
-                <w:szCs w:val="18"/>
-              </w:rPr>
-              <w:t>공동친권자</w:t>
-            </w:r>
-            <w:proofErr w:type="spellEnd"/>
-            <w:r>
-              <w:rPr>
-                <w:rFonts w:ascii="맑은 고딕" w:eastAsia="맑은 고딕" w:cs="맑은 고딕"/>
-                <w:sz w:val="18"/>
-                <w:szCs w:val="18"/>
-              </w:rPr>
-              <w:t xml:space="preserve"> 모두의 동의가 필요합니다.        </w:t>
+              <w:t xml:space="preserve"> (유의사항) 법정대리인이 공동친권자인 경우 공동친권자 모두의 동의가 필요합니다.        </w:t>
             </w:r>
           </w:p>
           <w:p>

</xml_diff>